<commit_message>
Regular payments, offers seen, and cheaper places under your own shops
- Regular payments: every subscription plus steady bills, with next due dates,
  free trials typed in, cancelled and not-seen-lately groups, and phone
  reminders 7, 3 and 1 day before (sent once per step from the daily check).
- Watchlist: "N offers seen" opens every offer found, cheapest first, to take
  one at today's price. Implausibly low prices (cases, monthly prices) no
  longer become the price to beat; changing the price clears it.
- Offers: each habit shows "Could cost less elsewhere" under your own shop's
  offers, from rival shops and cheaper or free alternatives.
- Coming up only shows buys that have an offer.
- Phone alerts now carry their own words (RFC 8291 encryption).

Co-Authored-By: Claude Opus 5.5 <noreply@anthropic.com>
Claude-Session: https://claude.ai/code/session_01KVo3uVuvZm97GC4aKgjh1N
</commit_message>
<xml_diff>
--- a/docs/Pence-features.docx
+++ b/docs/Pence-features.docx
@@ -237,7 +237,18 @@
         <w:rPr>
           <w:sz w:val="24"/>
         </w:rPr>
-        <w:t>Coming up shows the next two buys Pence expects from your own habits, such as a Saturday food shop or a Friday taxi, with the likely day and the usual spend.</w:t>
+        <w:t>Coming out soon lists regular payments and free trials due in the next 7 days. With none due, a short line opens the full list of regular payments.</w:t>
+      </w:r>
+    </w:p>
+    <w:p>
+      <w:pPr>
+        <w:pStyle w:val="ListBullet"/>
+      </w:pPr>
+      <w:r>
+        <w:rPr>
+          <w:sz w:val="24"/>
+        </w:rPr>
+        <w:t>Coming up shows the next two buys Pence expects from your own habits, such as a Saturday food shop or a Friday taxi, with the likely day and the usual spend. A buy only shows when there is an offer for it.</w:t>
       </w:r>
     </w:p>
     <w:p>
@@ -413,7 +424,29 @@
         <w:rPr>
           <w:sz w:val="24"/>
         </w:rPr>
-        <w:t>From that it expects the next buy, such as a food shop at Tesco on Saturday. Coming up lists those buys with deals for each one.</w:t>
+        <w:t>From that it expects the next buy, such as a food shop at Tesco on Saturday. Coming up lists those buys with deals for each one. A buy with no offer is left out.</w:t>
+      </w:r>
+    </w:p>
+    <w:p>
+      <w:pPr>
+        <w:pStyle w:val="ListBullet"/>
+      </w:pPr>
+      <w:r>
+        <w:rPr>
+          <w:sz w:val="24"/>
+        </w:rPr>
+        <w:t>Each habit lists offers at the shops you already use first, marked Your shop. Under them, Could cost less elsewhere shows offers for the same kind of thing at other shops or online, such as Aldi or Lidl when you shop at Tesco, or Vue when you go to Cineworld. Each says which shop you usually use.</w:t>
+      </w:r>
+    </w:p>
+    <w:p>
+      <w:pPr>
+        <w:pStyle w:val="ListBullet"/>
+      </w:pPr>
+      <w:r>
+        <w:rPr>
+          <w:sz w:val="24"/>
+        </w:rPr>
+        <w:t>For a paid service, such as a CV builder, the wider search also looks for cheaper or free alternatives from public pages.</w:t>
       </w:r>
     </w:p>
     <w:p>
@@ -567,6 +600,28 @@
         <w:rPr>
           <w:sz w:val="24"/>
         </w:rPr>
+        <w:t>Offers seen opens every offer found so far, cheapest first, so you can change your mind and take one at today’s price. A price far below the others, such as a case or a monthly price, is marked as unlikely to be the item and never becomes the price to beat.</w:t>
+      </w:r>
+    </w:p>
+    <w:p>
+      <w:pPr>
+        <w:pStyle w:val="ListBullet"/>
+      </w:pPr>
+      <w:r>
+        <w:rPr>
+          <w:sz w:val="24"/>
+        </w:rPr>
+        <w:t>Change price clears the price turned down, and offers seen before are checked again against the new price.</w:t>
+      </w:r>
+    </w:p>
+    <w:p>
+      <w:pPr>
+        <w:pStyle w:val="ListBullet"/>
+      </w:pPr>
+      <w:r>
+        <w:rPr>
+          <w:sz w:val="24"/>
+        </w:rPr>
         <w:t>The Watchlist is in the Offers tab: offers waiting for an answer first, then everything being watched. Each can be checked now, have its price changed, or be stopped.</w:t>
       </w:r>
     </w:p>
@@ -578,7 +633,128 @@
         <w:rPr>
           <w:sz w:val="24"/>
         </w:rPr>
-        <w:t>Home shows a card when Pence finds an offer, and the Offers tab shows a dot. Phone alerts can be turned on under the Watchlist. On iPhone, Pence must be added to the Home Screen first.</w:t>
+        <w:t>Home shows a card when Pence finds an offer, and the Offers tab shows a dot. Phone alerts can be turned on under the Watchlist, and the alert names what was found. On iPhone, Pence must be added to the Home Screen first.</w:t>
+      </w:r>
+    </w:p>
+    <w:p>
+      <w:pPr>
+        <w:pStyle w:val="Heading1"/>
+      </w:pPr>
+      <w:r>
+        <w:rPr>
+          <w:color w:val="1C3A2E"/>
+        </w:rPr>
+        <w:t>Regular payments</w:t>
+      </w:r>
+    </w:p>
+    <w:p>
+      <w:pPr>
+        <w:pStyle w:val="ListBullet"/>
+      </w:pPr>
+      <w:r>
+        <w:rPr>
+          <w:sz w:val="24"/>
+        </w:rPr>
+        <w:t>A list of subscriptions, bills, memberships and free trials, with when each one is next due and roughly what they cost in a month.</w:t>
+      </w:r>
+    </w:p>
+    <w:p>
+      <w:pPr>
+        <w:pStyle w:val="ListBullet"/>
+      </w:pPr>
+      <w:r>
+        <w:rPr>
+          <w:sz w:val="24"/>
+        </w:rPr>
+        <w:t>Every payment filed as a subscription is on the list, even one paid once. Other payments join it when they come back on a steady rhythm for about the same amount, such as rent, a gym, or a phone contract.</w:t>
+      </w:r>
+    </w:p>
+    <w:p>
+      <w:pPr>
+        <w:pStyle w:val="ListBullet"/>
+      </w:pPr>
+      <w:r>
+        <w:rPr>
+          <w:sz w:val="24"/>
+        </w:rPr>
+        <w:t>Payments with the same statement description count as one, so a renamed payee stays one entry.</w:t>
+      </w:r>
+    </w:p>
+    <w:p>
+      <w:pPr>
+        <w:pStyle w:val="ListBullet"/>
+      </w:pPr>
+      <w:r>
+        <w:rPr>
+          <w:sz w:val="24"/>
+        </w:rPr>
+        <w:t>Pence works out the next date from the last payment. When it has only one payment, it guesses every month and says so. Change fixes the name, amount, how often, and the next date.</w:t>
+      </w:r>
+    </w:p>
+    <w:p>
+      <w:pPr>
+        <w:pStyle w:val="ListBullet"/>
+      </w:pPr>
+      <w:r>
+        <w:rPr>
+          <w:sz w:val="24"/>
+        </w:rPr>
+        <w:t>Add a payment or free trial covers what the bank does not show yet, such as a trial that starts charging. Once means a free trial or a single payment; it drops off a few days after its date.</w:t>
+      </w:r>
+    </w:p>
+    <w:p>
+      <w:pPr>
+        <w:pStyle w:val="ListBullet"/>
+      </w:pPr>
+      <w:r>
+        <w:rPr>
+          <w:sz w:val="24"/>
+        </w:rPr>
+        <w:t>A phone alert comes 7 days, 3 days, and 1 day before each payment, naming it and the amount. Each reminder can be turned off. Phone alerts are turned on from the same page.</w:t>
+      </w:r>
+    </w:p>
+    <w:p>
+      <w:pPr>
+        <w:pStyle w:val="ListBullet"/>
+      </w:pPr>
+      <w:r>
+        <w:rPr>
+          <w:sz w:val="24"/>
+        </w:rPr>
+        <w:t>I’ve cancelled it moves a payment to Cancelled. If it is paid again after that, Pence shows it at the top under Check this.</w:t>
+      </w:r>
+    </w:p>
+    <w:p>
+      <w:pPr>
+        <w:pStyle w:val="ListBullet"/>
+      </w:pPr>
+      <w:r>
+        <w:rPr>
+          <w:sz w:val="24"/>
+        </w:rPr>
+        <w:t>Not seen lately lists payments that have not come out for longer than usual, to mark as cancelled or still paying.</w:t>
+      </w:r>
+    </w:p>
+    <w:p>
+      <w:pPr>
+        <w:pStyle w:val="ListBullet"/>
+      </w:pPr>
+      <w:r>
+        <w:rPr>
+          <w:sz w:val="24"/>
+        </w:rPr>
+        <w:t>How to cancel opens a web search for that service.</w:t>
+      </w:r>
+    </w:p>
+    <w:p>
+      <w:pPr>
+        <w:pStyle w:val="ListBullet"/>
+      </w:pPr>
+      <w:r>
+        <w:rPr>
+          <w:sz w:val="24"/>
+        </w:rPr>
+        <w:t>Opened from Home, from Settings, or from the side menu on a computer.</w:t>
       </w:r>
     </w:p>
     <w:p>
@@ -854,6 +1030,17 @@
           <w:sz w:val="24"/>
         </w:rPr>
         <w:t>Activity on Home is the latest spends, with All Activity opening the full list. Settings is on Home. Bank import is in Settings.</w:t>
+      </w:r>
+    </w:p>
+    <w:p>
+      <w:pPr>
+        <w:pStyle w:val="ListBullet"/>
+      </w:pPr>
+      <w:r>
+        <w:rPr>
+          <w:sz w:val="24"/>
+        </w:rPr>
+        <w:t>Regular payments opens from Coming out soon on Home, from Settings, and from the side menu on a computer.</w:t>
       </w:r>
     </w:p>
     <w:sectPr>

</xml_diff>

<commit_message>
Phone alerts: run the morning check on deploys; keep no receipt photos
- The schedule in vercel.json never reached prebuilt Vercel deploys, so the
  morning check (offer alerts, payment reminders) never ran and no alert was
  ever sent. The build config now carries it.
- If the morning check misses a day, the next visit runs it once.
- "Send a test" on the alerts panel shows an alert on this phone now and says
  plainly if the phone's push service turns it down; the panel shows when the
  morning check last ran.
- Pence keeps what it reads from a photo or PDF, never the picture. Saved
  photos are cleared; View receipt photo is gone.

Co-Authored-By: Claude Opus 5.5 <noreply@anthropic.com>
Claude-Session: https://claude.ai/code/session_01KVo3uVuvZm97GC4aKgjh1N
</commit_message>
<xml_diff>
--- a/docs/Pence-features.docx
+++ b/docs/Pence-features.docx
@@ -117,6 +117,17 @@
           <w:sz w:val="24"/>
         </w:rPr>
         <w:t>A receipt, photo or PDF, is read for the shop, date, total, and each line item. You can correct any of it before it is saved. Several receipts are checked one after another.</w:t>
+      </w:r>
+    </w:p>
+    <w:p>
+      <w:pPr>
+        <w:pStyle w:val="ListBullet"/>
+      </w:pPr>
+      <w:r>
+        <w:rPr>
+          <w:sz w:val="24"/>
+        </w:rPr>
+        <w:t>Pence keeps what it reads, the shop, amount, date and items, and never stores the photo or PDF. While you check a scan, the picture stays on that screen only. Photos saved before this change were cleared.</w:t>
       </w:r>
     </w:p>
     <w:p>
@@ -325,7 +336,7 @@
         <w:rPr>
           <w:sz w:val="24"/>
         </w:rPr>
-        <w:t>The receipt image, when one was saved, stays with the spend.</w:t>
+        <w:t>A spend read from a receipt says so. The photo itself is not kept.</w:t>
       </w:r>
     </w:p>
     <w:p>
@@ -711,6 +722,17 @@
           <w:sz w:val="24"/>
         </w:rPr>
         <w:t>A phone alert comes 7 days, 3 days, and 1 day before each payment, naming it and the amount. Each reminder can be turned off. Phone alerts are turned on from the same page.</w:t>
+      </w:r>
+    </w:p>
+    <w:p>
+      <w:pPr>
+        <w:pStyle w:val="ListBullet"/>
+      </w:pPr>
+      <w:r>
+        <w:rPr>
+          <w:sz w:val="24"/>
+        </w:rPr>
+        <w:t>Send a test shows an alert on this phone straight away, to check alerts arrive. The panel also says when the morning check last ran. If the morning check misses a day, the next visit to Pence runs it.</w:t>
       </w:r>
     </w:p>
     <w:p>

</xml_diff>